<commit_message>
docs: ulaz v3 s §10 (D32 live prikaz veza)
Co-Authored-By: Claude Opus 5.5 <noreply@anthropic.com>
</commit_message>
<xml_diff>
--- a/docs/inputs/ERP_v3_specifikacija_ulaz.docx
+++ b/docs/inputs/ERP_v3_specifikacija_ulaz.docx
@@ -3498,6 +3498,280 @@
         <w:t xml:space="preserve">Jedna točka kvara (jedan VPS): što i kada se odvaja (baza na zaseban stroj, drugi API čvor).</w:t>
       </w:r>
     </w:p>
+    <w:p>
+      <w:pPr>
+        <w:pStyle w:val="Heading1"/>
+      </w:pPr>
+      <w:r>
+        <w:t xml:space="preserve">10. D32 — Live prikaz veza (kamera), izmjena D30 — ODLUKA VLASNIKA 2026-10-16</w:t>
+      </w:r>
+    </w:p>
+    <w:p>
+      <w:pPr>
+        <w:pStyle w:val="Heading2"/>
+      </w:pPr>
+      <w:r>
+        <w:t xml:space="preserve">10.1 Odluka vlasnika</w:t>
+      </w:r>
+    </w:p>
+    <w:p>
+      <w:pPr>
+        <w:pStyle w:val="ListParagraph"/>
+        <w:numPr>
+          <w:ilvl w:val="0"/>
+          <w:numId w:val="2"/>
+        </w:numPr>
+      </w:pPr>
+      <w:r>
+        <w:t xml:space="preserve">U ERP-u na 2D karti uz vez/ormar postoji </w:t>
+      </w:r>
+      <w:r>
+        <w:rPr>
+          <w:b/>
+          <w:bCs/>
+        </w:rPr>
+        <w:t xml:space="preserve">ikona kamere</w:t>
+      </w:r>
+      <w:r>
+        <w:t xml:space="preserve">: zelena = kamera aktivna i dostupna za prijenos; siva = nedostupna; bez ikone = nema kamere. Status računa server.</w:t>
+      </w:r>
+    </w:p>
+    <w:p>
+      <w:pPr>
+        <w:pStyle w:val="ListParagraph"/>
+        <w:numPr>
+          <w:ilvl w:val="0"/>
+          <w:numId w:val="2"/>
+        </w:numPr>
+      </w:pPr>
+      <w:r>
+        <w:t xml:space="preserve">Klik na ikonu otvara </w:t>
+      </w:r>
+      <w:r>
+        <w:rPr>
+          <w:b/>
+          <w:bCs/>
+        </w:rPr>
+        <w:t xml:space="preserve">live prijenos veza</w:t>
+      </w:r>
+      <w:r>
+        <w:t xml:space="preserve"> u ERP-u.</w:t>
+      </w:r>
+    </w:p>
+    <w:p>
+      <w:pPr>
+        <w:pStyle w:val="ListParagraph"/>
+        <w:numPr>
+          <w:ilvl w:val="0"/>
+          <w:numId w:val="2"/>
+        </w:numPr>
+      </w:pPr>
+      <w:r>
+        <w:t xml:space="preserve">Ista funkcija postoji u mobilnoj aplikaciji ("My Ship live") — kupac gleda SVOJ vez; zaposlenik po pravima uloge.</w:t>
+      </w:r>
+    </w:p>
+    <w:p>
+      <w:pPr>
+        <w:pStyle w:val="Heading2"/>
+      </w:pPr>
+      <w:r>
+        <w:t xml:space="preserve">10.2 Odnos prema D30</w:t>
+      </w:r>
+    </w:p>
+    <w:p>
+      <w:pPr>
+        <w:pStyle w:val="ListParagraph"/>
+        <w:numPr>
+          <w:ilvl w:val="0"/>
+          <w:numId w:val="2"/>
+        </w:numPr>
+      </w:pPr>
+      <w:r>
+        <w:t xml:space="preserve">D30 ostaje za </w:t>
+      </w:r>
+      <w:r>
+        <w:rPr>
+          <w:b/>
+          <w:bCs/>
+        </w:rPr>
+        <w:t xml:space="preserve">analizu</w:t>
+      </w:r>
+      <w:r>
+        <w:t xml:space="preserve">: referentne slike, match, zauzeće — procjena na ormaru, prema ERP-u samo rezultat.</w:t>
+      </w:r>
+    </w:p>
+    <w:p>
+      <w:pPr>
+        <w:pStyle w:val="ListParagraph"/>
+        <w:numPr>
+          <w:ilvl w:val="0"/>
+          <w:numId w:val="2"/>
+        </w:numPr>
+      </w:pPr>
+      <w:r>
+        <w:t xml:space="preserve">D32 dodaje </w:t>
+      </w:r>
+      <w:r>
+        <w:rPr>
+          <w:b/>
+          <w:bCs/>
+        </w:rPr>
+        <w:t xml:space="preserve">živi prijenos na zahtjev</w:t>
+      </w:r>
+      <w:r>
+        <w:t xml:space="preserve"> kao zasebnu funkciju s vlastitim pravilima (ispod). Ništa se ne snima ni ne sprema na ERP-u.</w:t>
+      </w:r>
+    </w:p>
+    <w:p>
+      <w:pPr>
+        <w:pStyle w:val="Heading2"/>
+      </w:pPr>
+      <w:r>
+        <w:t xml:space="preserve">10.3 Pravila (prijedlog arhitekta — Code ih piše kao trojke u §1)</w:t>
+      </w:r>
+    </w:p>
+    <w:p>
+      <w:pPr>
+        <w:pStyle w:val="ListParagraph"/>
+        <w:numPr>
+          <w:ilvl w:val="0"/>
+          <w:numId w:val="2"/>
+        </w:numPr>
+      </w:pPr>
+      <w:r>
+        <w:rPr>
+          <w:b/>
+          <w:bCs/>
+        </w:rPr>
+        <w:t xml:space="preserve">Put prijenosa (D12):</w:t>
+      </w:r>
+      <w:r>
+        <w:t xml:space="preserve"> kamera → ormar (nginx :80, ext ključ za stream) → ERP → preglednik/aplikacija. Aplikacija i preglednik nikad ne idu na ormar ni na kameru. ERP pokreće povlačenje s ormara SAMO dok netko gleda.</w:t>
+      </w:r>
+    </w:p>
+    <w:p>
+      <w:pPr>
+        <w:pStyle w:val="ListParagraph"/>
+        <w:numPr>
+          <w:ilvl w:val="0"/>
+          <w:numId w:val="2"/>
+        </w:numPr>
+      </w:pPr>
+      <w:r>
+        <w:rPr>
+          <w:b/>
+          <w:bCs/>
+        </w:rPr>
+        <w:t xml:space="preserve">Medijski sloj:</w:t>
+      </w:r>
+      <w:r>
+        <w:t xml:space="preserve"> prijedlog lagani media relay na VPS-u (npr. MediaMTX) koji na zahtjev povlači stream s ormara i daje ga gledateljima (HLS ili WebRTC); jedan dolazni stream po kameri bez obzira na broj gledatelja.</w:t>
+      </w:r>
+    </w:p>
+    <w:p>
+      <w:pPr>
+        <w:pStyle w:val="ListParagraph"/>
+        <w:numPr>
+          <w:ilvl w:val="0"/>
+          <w:numId w:val="2"/>
+        </w:numPr>
+      </w:pPr>
+      <w:r>
+        <w:rPr>
+          <w:b/>
+          <w:bCs/>
+        </w:rPr>
+        <w:t xml:space="preserve">Ograničenja:</w:t>
+      </w:r>
+      <w:r>
+        <w:t xml:space="preserve"> najviše N istovremenih gledatelja po kameri, najdulje trajanje gledanja (npr. 2–5 min, pa ponovni klik), niža rezolucija/bitrate (veza ormara je često LTE), bez snimanja.</w:t>
+      </w:r>
+    </w:p>
+    <w:p>
+      <w:pPr>
+        <w:pStyle w:val="ListParagraph"/>
+        <w:numPr>
+          <w:ilvl w:val="0"/>
+          <w:numId w:val="2"/>
+        </w:numPr>
+      </w:pPr>
+      <w:r>
+        <w:rPr>
+          <w:b/>
+          <w:bCs/>
+        </w:rPr>
+        <w:t xml:space="preserve">Prava:</w:t>
+      </w:r>
+      <w:r>
+        <w:t xml:space="preserve"> kupac samo kamera svog veza (vez iz važećeg ugovora); zaposlenik po matrici prava; Admin u admin modu. Svako gledanje ide u audit (tko, kada, koja kamera, koliko dugo).</w:t>
+      </w:r>
+    </w:p>
+    <w:p>
+      <w:pPr>
+        <w:pStyle w:val="ListParagraph"/>
+        <w:numPr>
+          <w:ilvl w:val="0"/>
+          <w:numId w:val="2"/>
+        </w:numPr>
+      </w:pPr>
+      <w:r>
+        <w:rPr>
+          <w:b/>
+          <w:bCs/>
+        </w:rPr>
+        <w:t xml:space="preserve">GDPR (D15):</w:t>
+      </w:r>
+      <w:r>
+        <w:t xml:space="preserve"> živi video ljudi u marini je videonadzor. Obavezno: oznaka videonadzora u marini; maske privatnosti (privacy mask) na kameri tako da se vidi samo vez; zamagljivanje osoba na ormaru prije slanja ako je izvedivo u stvarnom vremenu — ako nije, za §1 s prijedlogom; nema snimanja; svrha i pravna osnova zapisani.</w:t>
+      </w:r>
+    </w:p>
+    <w:p>
+      <w:pPr>
+        <w:pStyle w:val="ListParagraph"/>
+        <w:numPr>
+          <w:ilvl w:val="0"/>
+          <w:numId w:val="2"/>
+        </w:numPr>
+      </w:pPr>
+      <w:r>
+        <w:rPr>
+          <w:b/>
+          <w:bCs/>
+        </w:rPr>
+        <w:t xml:space="preserve">Sigurnost:</w:t>
+      </w:r>
+      <w:r>
+        <w:t xml:space="preserve"> stream s ormara samo preko Tailscalea; kratkotrajni potpisani URL za gledatelja (vezan uz korisnika i kameru, istječe); nikakve trajne adrese kamera u klijentu.</w:t>
+      </w:r>
+    </w:p>
+    <w:p>
+      <w:pPr>
+        <w:pStyle w:val="ListParagraph"/>
+        <w:numPr>
+          <w:ilvl w:val="0"/>
+          <w:numId w:val="2"/>
+        </w:numPr>
+      </w:pPr>
+      <w:r>
+        <w:rPr>
+          <w:b/>
+          <w:bCs/>
+        </w:rPr>
+        <w:t xml:space="preserve">Zahtjevi prema ormaru (§7.2):</w:t>
+      </w:r>
+      <w:r>
+        <w:t xml:space="preserve"> uključiti </w:t>
+      </w:r>
+      <w:r>
+        <w:rPr>
+          <w:rFonts w:ascii="Consolas" w:cs="Consolas" w:eastAsia="Consolas" w:hAnsi="Consolas"/>
+        </w:rPr>
+        <w:t xml:space="preserve">camera.stream_ext</w:t>
+      </w:r>
+      <w:r>
+        <w:t xml:space="preserve"> (i status kamere) u gateway za ERP; maske privatnosti; zamagljivanje osoba (izvedivost i cijena CPU-a na ormaru); stream samo dok ERP traži.</w:t>
+      </w:r>
+    </w:p>
     <w:sectPr>
       <w:footerReference w:type="default" r:id="rId7"/>
       <w:pgSz w:w="11906" w:h="16838" w:orient="portrait"/>
@@ -3562,7 +3836,7 @@
         <w:sz w:val="16"/>
         <w:szCs w:val="16"/>
       </w:rPr>
-      <w:t xml:space="preserve">ERP v3 ulaz — bez osobnih podataka · str. </w:t>
+      <w:t xml:space="preserve">Lika Digital — bez osobnih podataka · str. </w:t>
     </w:r>
     <w:r>
       <w:rPr>

</xml_diff>